<commit_message>
pequeño cambio actividad tema 1 daw
</commit_message>
<xml_diff>
--- a/Despliegue de aplicaciones web/Tema_01/Actividades/Aplicación banca online.docx
+++ b/Despliegue de aplicaciones web/Tema_01/Actividades/Aplicación banca online.docx
@@ -87,6 +87,22 @@
         </w:rPr>
         <w:t xml:space="preserve"> diferentes operaciones como</w:t>
       </w:r>
+      <w:r>
+        <w:rPr>
+          <w:rFonts w:ascii="Times New Roman" w:hAnsi="Times New Roman" w:cs="Times New Roman"/>
+          <w:sz w:val="24"/>
+          <w:szCs w:val="24"/>
+        </w:rPr>
+        <w:t xml:space="preserve"> transfer</w:t>
+      </w:r>
+      <w:r>
+        <w:rPr>
+          <w:rFonts w:ascii="Times New Roman" w:hAnsi="Times New Roman" w:cs="Times New Roman"/>
+          <w:sz w:val="24"/>
+          <w:szCs w:val="24"/>
+        </w:rPr>
+        <w:t>encias bancarias</w:t>
+      </w:r>
       <w:bookmarkStart w:id="0" w:name="_GoBack"/>
       <w:bookmarkEnd w:id="0"/>
       <w:r>
@@ -95,7 +111,7 @@
           <w:sz w:val="24"/>
           <w:szCs w:val="24"/>
         </w:rPr>
-        <w:t xml:space="preserve"> transferencias bancarias, realizar pagos y consultar estado de la cuenta.</w:t>
+        <w:t xml:space="preserve"> y consultar estado de la cuenta.</w:t>
       </w:r>
     </w:p>
     <w:p>
@@ -147,7 +163,15 @@
           <w:sz w:val="24"/>
           <w:szCs w:val="24"/>
         </w:rPr>
-        <w:t xml:space="preserve"> por ejemplo, “ver cuenta”, “Hacer transferencia”, “realizar pagos”</w:t>
+        <w:t xml:space="preserve"> por ejemplo, “ver cuenta”, “Hacer </w:t>
+      </w:r>
+      <w:r>
+        <w:rPr>
+          <w:rFonts w:ascii="Times New Roman" w:hAnsi="Times New Roman" w:cs="Times New Roman"/>
+          <w:sz w:val="24"/>
+          <w:szCs w:val="24"/>
+        </w:rPr>
+        <w:t>transferencia”.</w:t>
       </w:r>
     </w:p>
     <w:p>

</xml_diff>